<commit_message>
Front Desk update memo: drop Sales reports line (front desk won't have that page)
</commit_message>
<xml_diff>
--- a/HDDR-documents/HDDR-Front-Desk-Update-Oct-9-2026.docx
+++ b/HDDR-documents/HDDR-Front-Desk-Update-Oct-9-2026.docx
@@ -169,28 +169,6 @@
       </w:r>
       <w:r>
         <w:t xml:space="preserve"> so the whole team sees it instead of it coming to me and me forwarding it. The one on purpose exception is the in-home training inquiry, which still goes to Penny.</w:t>
-      </w:r>
-    </w:p>
-    <w:p>
-      <w:pPr>
-        <w:pStyle w:val="ListParagraph"/>
-        <w:numPr>
-          <w:ilvl w:val="0"/>
-          <w:numId w:val="2"/>
-        </w:numPr>
-      </w:pPr>
-      <w:r>
-        <w:t xml:space="preserve">The </w:t>
-      </w:r>
-      <w:r>
-        <w:rPr>
-          <w:b/>
-          <w:bCs/>
-        </w:rPr>
-        <w:t xml:space="preserve">Sales reports</w:t>
-      </w:r>
-      <w:r>
-        <w:t xml:space="preserve"> page got the monthly numbers I need for the government report, how much of our business is online and how much came in by each payment method, month by month.</w:t>
       </w:r>
     </w:p>
     <w:p>

</xml_diff>